<commit_message>
Key dates on every post, Deadlines page with a Past section, review fixes
- New optional key_dates field (date, label, note, official page) on any
  post; 57 dates added to the 17 university guides from their own text
- Deadlines page lists opportunity deadlines plus all key dates, upcoming
  by month, rolling, then every past date in a collapsed Past section
- Cards badge the next upcoming date; post pages show a Key dates box;
  home "Closing soon" strip uses all dated items
- Home page counts main-category posts only; university guides no longer
  listed under Courses
- About says "five things"; footer and About agree: built by Madan,
  run by the FP team
- IISc heading and VIT summary no longer centre on Erode
- Pages CMS form and Word templates gain the Key dates field

Co-Authored-By: Claude Fable 5.1 <noreply@anthropic.com>
</commit_message>
<xml_diff>
--- a/docs/templates/FP-post-template-careers.docx
+++ b/docs/templates/FP-post-template-careers.docx
@@ -805,6 +805,55 @@
                 <w:i w:val="0"/>
                 <w:sz w:val="21"/>
               </w:rPr>
+              <w:t>Key dates (optional)</w:t>
+            </w:r>
+          </w:p>
+        </w:tc>
+        <w:tc>
+          <w:tcPr>
+            <w:tcW w:type="dxa" w:w="6236"/>
+            <w:tcBorders>
+              <w:top w:val="nil"/>
+              <w:left w:val="nil"/>
+              <w:right w:val="nil"/>
+              <w:bottom w:val="single" w:sz="4" w:color="D6E2F0"/>
+            </w:tcBorders>
+          </w:tcPr>
+          <w:p>
+            <w:r/>
+            <w:r>
+              <w:rPr>
+                <w:rFonts w:ascii="Calibri" w:hAnsi="Calibri" w:eastAsia="Calibri"/>
+                <w:b w:val="0"/>
+                <w:i w:val="0"/>
+                <w:color w:val="4F6176"/>
+                <w:sz w:val="20"/>
+              </w:rPr>
+              <w:t>Each important date in the post: the date, what happens, a note such as the time zone, and the official page.</w:t>
+            </w:r>
+          </w:p>
+        </w:tc>
+      </w:tr>
+      <w:tr>
+        <w:tc>
+          <w:tcPr>
+            <w:tcW w:type="dxa" w:w="3118"/>
+            <w:tcBorders>
+              <w:top w:val="nil"/>
+              <w:left w:val="nil"/>
+              <w:right w:val="nil"/>
+              <w:bottom w:val="single" w:sz="4" w:color="D6E2F0"/>
+            </w:tcBorders>
+          </w:tcPr>
+          <w:p>
+            <w:r/>
+            <w:r>
+              <w:rPr>
+                <w:rFonts w:ascii="Calibri" w:hAnsi="Calibri" w:eastAsia="Calibri"/>
+                <w:b/>
+                <w:i w:val="0"/>
+                <w:sz w:val="21"/>
+              </w:rPr>
               <w:t>Cover image (optional)</w:t>
             </w:r>
           </w:p>

</xml_diff>